<commit_message>
Publish Chapter 5 Report 03 and refresh report packages
Add Modelling Hypothesized Mechanisms Underlying Data with its English report, figures, evidence records, validation script and downloadable editions. Refresh chapter navigation and publication metadata.
</commit_message>
<xml_diff>
--- a/Chapter_4_Data_Zoo/Human_Learning_and_Sensorimotor_Geometry/Data_Zoo_02_Human_Learning_and_Sensorimotor_Geometry_EN_v1.0.docx
+++ b/Chapter_4_Data_Zoo/Human_Learning_and_Sensorimotor_Geometry/Data_Zoo_02_Human_Learning_and_Sensorimotor_Geometry_EN_v1.0.docx
@@ -15,7 +15,7 @@
         <w:pStyle w:val="Subtitle"/>
       </w:pPr>
       <w:r>
-        <w:t>Biosphere 3 · Chapter 4 Data Zoo · Subreport 2</w:t>
+        <w:t>Data-Oriented Modelling · Chapter 4 Data Zoo · Subreport 2</w:t>
       </w:r>
     </w:p>
     <w:p>
@@ -18167,7 +18167,7 @@
           <w:color w:val="000000"/>
           <w:sz w:val="21"/>
         </w:rPr>
-        <w:t>Natural-language corpus: walkingrui-bot/biosphere-3-public-reports, Chapter 3 evidence bundle, Git blob 51ccc565cb49f1da25c5791e62a8590ff2f72992.</w:t>
+        <w:t>Natural-language corpus: walkingrui-bot/Data-Oriented-Modelling-Reports, Chapter 3 evidence bundle, Git blob 51ccc565cb49f1da25c5791e62a8590ff2f72992.</w:t>
       </w:r>
     </w:p>
     <w:p>

</xml_diff>